<commit_message>
Sync from Labs (d74c651)
</commit_message>
<xml_diff>
--- a/Lab4/questionnaire/Lab 4 - Questionnaire.docx
+++ b/Lab4/questionnaire/Lab 4 - Questionnaire.docx
@@ -304,6 +304,9 @@
         <w:gridCol w:w="4826"/>
       </w:tblGrid>
       <w:tr>
+        <w:trPr>
+          <w:cantSplit w:val="1"/>
+        </w:trPr>
         <w:tc>
           <w:tcPr>
             <w:tcW w:type="dxa" w:w="4200"/>
@@ -321,6 +324,9 @@
             </w:tcMar>
           </w:tcPr>
           <w:p>
+            <w:pPr>
+              <w:keepNext/>
+            </w:pPr>
             <w:r>
               <w:rPr>
                 <w:rFonts w:ascii="Calibri" w:cs="Calibri" w:eastAsia="Calibri" w:hAnsi="Calibri"/>
@@ -354,6 +360,7 @@
                 <w:ilvl w:val="0"/>
                 <w:numId w:val="2"/>
               </w:numPr>
+              <w:keepNext/>
             </w:pPr>
             <w:r>
               <w:rPr>
@@ -371,6 +378,7 @@
                 <w:ilvl w:val="0"/>
                 <w:numId w:val="2"/>
               </w:numPr>
+              <w:keepNext/>
             </w:pPr>
             <w:r>
               <w:rPr>
@@ -388,6 +396,7 @@
                 <w:ilvl w:val="0"/>
                 <w:numId w:val="2"/>
               </w:numPr>
+              <w:keepNext/>
             </w:pPr>
             <w:r>
               <w:rPr>
@@ -403,6 +412,7 @@
       <w:tr>
         <w:trPr>
           <w:trHeight w:val="3000" w:hRule="atLeast"/>
+          <w:cantSplit w:val="1"/>
         </w:trPr>
         <w:tc>
           <w:tcPr>
@@ -454,6 +464,9 @@
         <w:gridCol w:w="4826"/>
       </w:tblGrid>
       <w:tr>
+        <w:trPr>
+          <w:cantSplit w:val="1"/>
+        </w:trPr>
         <w:tc>
           <w:tcPr>
             <w:tcW w:type="dxa" w:w="4200"/>
@@ -471,6 +484,9 @@
             </w:tcMar>
           </w:tcPr>
           <w:p>
+            <w:pPr>
+              <w:keepNext/>
+            </w:pPr>
             <w:r>
               <w:rPr>
                 <w:rFonts w:ascii="Calibri" w:cs="Calibri" w:eastAsia="Calibri" w:hAnsi="Calibri"/>
@@ -504,6 +520,7 @@
                 <w:ilvl w:val="0"/>
                 <w:numId w:val="2"/>
               </w:numPr>
+              <w:keepNext/>
             </w:pPr>
             <w:r>
               <w:rPr>
@@ -521,6 +538,7 @@
                 <w:ilvl w:val="0"/>
                 <w:numId w:val="2"/>
               </w:numPr>
+              <w:keepNext/>
             </w:pPr>
             <w:r>
               <w:rPr>
@@ -536,6 +554,7 @@
       <w:tr>
         <w:trPr>
           <w:trHeight w:val="3000" w:hRule="atLeast"/>
+          <w:cantSplit w:val="1"/>
         </w:trPr>
         <w:tc>
           <w:tcPr>
@@ -587,6 +606,9 @@
         <w:gridCol w:w="4826"/>
       </w:tblGrid>
       <w:tr>
+        <w:trPr>
+          <w:cantSplit w:val="1"/>
+        </w:trPr>
         <w:tc>
           <w:tcPr>
             <w:tcW w:type="dxa" w:w="4200"/>
@@ -604,6 +626,9 @@
             </w:tcMar>
           </w:tcPr>
           <w:p>
+            <w:pPr>
+              <w:keepNext/>
+            </w:pPr>
             <w:r>
               <w:rPr>
                 <w:rFonts w:ascii="Calibri" w:cs="Calibri" w:eastAsia="Calibri" w:hAnsi="Calibri"/>
@@ -637,6 +662,7 @@
                 <w:ilvl w:val="0"/>
                 <w:numId w:val="2"/>
               </w:numPr>
+              <w:keepNext/>
             </w:pPr>
             <w:r>
               <w:rPr>
@@ -654,6 +680,7 @@
                 <w:ilvl w:val="0"/>
                 <w:numId w:val="2"/>
               </w:numPr>
+              <w:keepNext/>
             </w:pPr>
             <w:r>
               <w:rPr>
@@ -669,6 +696,7 @@
       <w:tr>
         <w:trPr>
           <w:trHeight w:val="3000" w:hRule="atLeast"/>
+          <w:cantSplit w:val="1"/>
         </w:trPr>
         <w:tc>
           <w:tcPr>
@@ -720,6 +748,9 @@
         <w:gridCol w:w="4826"/>
       </w:tblGrid>
       <w:tr>
+        <w:trPr>
+          <w:cantSplit w:val="1"/>
+        </w:trPr>
         <w:tc>
           <w:tcPr>
             <w:tcW w:type="dxa" w:w="4200"/>
@@ -737,6 +768,9 @@
             </w:tcMar>
           </w:tcPr>
           <w:p>
+            <w:pPr>
+              <w:keepNext/>
+            </w:pPr>
             <w:r>
               <w:rPr>
                 <w:rFonts w:ascii="Calibri" w:cs="Calibri" w:eastAsia="Calibri" w:hAnsi="Calibri"/>
@@ -770,6 +804,7 @@
                 <w:ilvl w:val="0"/>
                 <w:numId w:val="2"/>
               </w:numPr>
+              <w:keepNext/>
             </w:pPr>
             <w:r>
               <w:rPr>
@@ -787,6 +822,7 @@
                 <w:ilvl w:val="0"/>
                 <w:numId w:val="2"/>
               </w:numPr>
+              <w:keepNext/>
             </w:pPr>
             <w:r>
               <w:rPr>
@@ -804,6 +840,7 @@
                 <w:ilvl w:val="0"/>
                 <w:numId w:val="2"/>
               </w:numPr>
+              <w:keepNext/>
             </w:pPr>
             <w:r>
               <w:rPr>
@@ -819,6 +856,7 @@
       <w:tr>
         <w:trPr>
           <w:trHeight w:val="3000" w:hRule="atLeast"/>
+          <w:cantSplit w:val="1"/>
         </w:trPr>
         <w:tc>
           <w:tcPr>
@@ -870,6 +908,9 @@
         <w:gridCol w:w="4826"/>
       </w:tblGrid>
       <w:tr>
+        <w:trPr>
+          <w:cantSplit w:val="1"/>
+        </w:trPr>
         <w:tc>
           <w:tcPr>
             <w:tcW w:type="dxa" w:w="4200"/>
@@ -887,6 +928,9 @@
             </w:tcMar>
           </w:tcPr>
           <w:p>
+            <w:pPr>
+              <w:keepNext/>
+            </w:pPr>
             <w:r>
               <w:rPr>
                 <w:rFonts w:ascii="Calibri" w:cs="Calibri" w:eastAsia="Calibri" w:hAnsi="Calibri"/>
@@ -920,6 +964,7 @@
                 <w:ilvl w:val="0"/>
                 <w:numId w:val="2"/>
               </w:numPr>
+              <w:keepNext/>
             </w:pPr>
             <w:r>
               <w:rPr>
@@ -937,6 +982,7 @@
                 <w:ilvl w:val="0"/>
                 <w:numId w:val="2"/>
               </w:numPr>
+              <w:keepNext/>
             </w:pPr>
             <w:r>
               <w:rPr>
@@ -952,6 +998,7 @@
       <w:tr>
         <w:trPr>
           <w:trHeight w:val="3000" w:hRule="atLeast"/>
+          <w:cantSplit w:val="1"/>
         </w:trPr>
         <w:tc>
           <w:tcPr>
@@ -1003,6 +1050,9 @@
         <w:gridCol w:w="4826"/>
       </w:tblGrid>
       <w:tr>
+        <w:trPr>
+          <w:cantSplit w:val="1"/>
+        </w:trPr>
         <w:tc>
           <w:tcPr>
             <w:tcW w:type="dxa" w:w="4200"/>
@@ -1020,6 +1070,9 @@
             </w:tcMar>
           </w:tcPr>
           <w:p>
+            <w:pPr>
+              <w:keepNext/>
+            </w:pPr>
             <w:r>
               <w:rPr>
                 <w:rFonts w:ascii="Calibri" w:cs="Calibri" w:eastAsia="Calibri" w:hAnsi="Calibri"/>
@@ -1053,6 +1106,7 @@
                 <w:ilvl w:val="0"/>
                 <w:numId w:val="2"/>
               </w:numPr>
+              <w:keepNext/>
             </w:pPr>
             <w:r>
               <w:rPr>
@@ -1070,6 +1124,7 @@
                 <w:ilvl w:val="0"/>
                 <w:numId w:val="2"/>
               </w:numPr>
+              <w:keepNext/>
             </w:pPr>
             <w:r>
               <w:rPr>
@@ -1087,6 +1142,7 @@
                 <w:ilvl w:val="0"/>
                 <w:numId w:val="2"/>
               </w:numPr>
+              <w:keepNext/>
             </w:pPr>
             <w:r>
               <w:rPr>
@@ -1102,6 +1158,7 @@
       <w:tr>
         <w:trPr>
           <w:trHeight w:val="3000" w:hRule="atLeast"/>
+          <w:cantSplit w:val="1"/>
         </w:trPr>
         <w:tc>
           <w:tcPr>
@@ -1178,6 +1235,9 @@
         <w:gridCol w:w="4826"/>
       </w:tblGrid>
       <w:tr>
+        <w:trPr>
+          <w:cantSplit w:val="1"/>
+        </w:trPr>
         <w:tc>
           <w:tcPr>
             <w:tcW w:type="dxa" w:w="4200"/>
@@ -1195,6 +1255,9 @@
             </w:tcMar>
           </w:tcPr>
           <w:p>
+            <w:pPr>
+              <w:keepNext/>
+            </w:pPr>
             <w:r>
               <w:rPr>
                 <w:rFonts w:ascii="Calibri" w:cs="Calibri" w:eastAsia="Calibri" w:hAnsi="Calibri"/>
@@ -1228,6 +1291,7 @@
                 <w:ilvl w:val="0"/>
                 <w:numId w:val="2"/>
               </w:numPr>
+              <w:keepNext/>
             </w:pPr>
             <w:r>
               <w:rPr>
@@ -1245,6 +1309,7 @@
                 <w:ilvl w:val="0"/>
                 <w:numId w:val="2"/>
               </w:numPr>
+              <w:keepNext/>
             </w:pPr>
             <w:r>
               <w:rPr>
@@ -1260,6 +1325,7 @@
       <w:tr>
         <w:trPr>
           <w:trHeight w:val="3000" w:hRule="atLeast"/>
+          <w:cantSplit w:val="1"/>
         </w:trPr>
         <w:tc>
           <w:tcPr>
@@ -1311,6 +1377,9 @@
         <w:gridCol w:w="4826"/>
       </w:tblGrid>
       <w:tr>
+        <w:trPr>
+          <w:cantSplit w:val="1"/>
+        </w:trPr>
         <w:tc>
           <w:tcPr>
             <w:tcW w:type="dxa" w:w="4200"/>
@@ -1328,6 +1397,9 @@
             </w:tcMar>
           </w:tcPr>
           <w:p>
+            <w:pPr>
+              <w:keepNext/>
+            </w:pPr>
             <w:r>
               <w:rPr>
                 <w:rFonts w:ascii="Calibri" w:cs="Calibri" w:eastAsia="Calibri" w:hAnsi="Calibri"/>
@@ -1361,6 +1433,7 @@
                 <w:ilvl w:val="0"/>
                 <w:numId w:val="2"/>
               </w:numPr>
+              <w:keepNext/>
             </w:pPr>
             <w:r>
               <w:rPr>
@@ -1376,6 +1449,7 @@
       <w:tr>
         <w:trPr>
           <w:trHeight w:val="3000" w:hRule="atLeast"/>
+          <w:cantSplit w:val="1"/>
         </w:trPr>
         <w:tc>
           <w:tcPr>
@@ -1427,6 +1501,9 @@
         <w:gridCol w:w="4826"/>
       </w:tblGrid>
       <w:tr>
+        <w:trPr>
+          <w:cantSplit w:val="1"/>
+        </w:trPr>
         <w:tc>
           <w:tcPr>
             <w:tcW w:type="dxa" w:w="4200"/>
@@ -1444,6 +1521,9 @@
             </w:tcMar>
           </w:tcPr>
           <w:p>
+            <w:pPr>
+              <w:keepNext/>
+            </w:pPr>
             <w:r>
               <w:rPr>
                 <w:rFonts w:ascii="Calibri" w:cs="Calibri" w:eastAsia="Calibri" w:hAnsi="Calibri"/>
@@ -1477,6 +1557,7 @@
                 <w:ilvl w:val="0"/>
                 <w:numId w:val="2"/>
               </w:numPr>
+              <w:keepNext/>
             </w:pPr>
             <w:r>
               <w:rPr>
@@ -1494,6 +1575,7 @@
                 <w:ilvl w:val="0"/>
                 <w:numId w:val="2"/>
               </w:numPr>
+              <w:keepNext/>
             </w:pPr>
             <w:r>
               <w:rPr>
@@ -1511,6 +1593,7 @@
                 <w:ilvl w:val="0"/>
                 <w:numId w:val="2"/>
               </w:numPr>
+              <w:keepNext/>
             </w:pPr>
             <w:r>
               <w:rPr>
@@ -1526,6 +1609,7 @@
       <w:tr>
         <w:trPr>
           <w:trHeight w:val="3000" w:hRule="atLeast"/>
+          <w:cantSplit w:val="1"/>
         </w:trPr>
         <w:tc>
           <w:tcPr>
@@ -1577,6 +1661,9 @@
         <w:gridCol w:w="4826"/>
       </w:tblGrid>
       <w:tr>
+        <w:trPr>
+          <w:cantSplit w:val="1"/>
+        </w:trPr>
         <w:tc>
           <w:tcPr>
             <w:tcW w:type="dxa" w:w="4200"/>
@@ -1594,6 +1681,9 @@
             </w:tcMar>
           </w:tcPr>
           <w:p>
+            <w:pPr>
+              <w:keepNext/>
+            </w:pPr>
             <w:r>
               <w:rPr>
                 <w:rFonts w:ascii="Calibri" w:cs="Calibri" w:eastAsia="Calibri" w:hAnsi="Calibri"/>
@@ -1621,6 +1711,9 @@
             </w:tcMar>
           </w:tcPr>
           <w:p>
+            <w:pPr>
+              <w:keepNext/>
+            </w:pPr>
             <w:r>
               <w:t xml:space="preserve"/>
             </w:r>
@@ -1630,6 +1723,7 @@
       <w:tr>
         <w:trPr>
           <w:trHeight w:val="3000" w:hRule="atLeast"/>
+          <w:cantSplit w:val="1"/>
         </w:trPr>
         <w:tc>
           <w:tcPr>

</xml_diff>

<commit_message>
Sync from Labs (e8498d0)
</commit_message>
<xml_diff>
--- a/Lab4/questionnaire/Lab 4 - Questionnaire.docx
+++ b/Lab4/questionnaire/Lab 4 - Questionnaire.docx
@@ -411,8 +411,8 @@
       </w:tr>
       <w:tr>
         <w:trPr>
-          <w:trHeight w:val="3000" w:hRule="atLeast"/>
           <w:cantSplit w:val="1"/>
+          <w:trHeight w:val="3969" w:hRule="exact"/>
         </w:trPr>
         <w:tc>
           <w:tcPr>
@@ -553,8 +553,8 @@
       </w:tr>
       <w:tr>
         <w:trPr>
-          <w:trHeight w:val="3000" w:hRule="atLeast"/>
           <w:cantSplit w:val="1"/>
+          <w:trHeight w:val="3969" w:hRule="exact"/>
         </w:trPr>
         <w:tc>
           <w:tcPr>
@@ -695,8 +695,8 @@
       </w:tr>
       <w:tr>
         <w:trPr>
-          <w:trHeight w:val="3000" w:hRule="atLeast"/>
           <w:cantSplit w:val="1"/>
+          <w:trHeight w:val="5670" w:hRule="exact"/>
         </w:trPr>
         <w:tc>
           <w:tcPr>
@@ -855,8 +855,8 @@
       </w:tr>
       <w:tr>
         <w:trPr>
-          <w:trHeight w:val="3000" w:hRule="atLeast"/>
           <w:cantSplit w:val="1"/>
+          <w:trHeight w:val="3969" w:hRule="exact"/>
         </w:trPr>
         <w:tc>
           <w:tcPr>
@@ -997,8 +997,8 @@
       </w:tr>
       <w:tr>
         <w:trPr>
-          <w:trHeight w:val="3000" w:hRule="atLeast"/>
           <w:cantSplit w:val="1"/>
+          <w:trHeight w:val="3969" w:hRule="exact"/>
         </w:trPr>
         <w:tc>
           <w:tcPr>
@@ -1157,8 +1157,8 @@
       </w:tr>
       <w:tr>
         <w:trPr>
-          <w:trHeight w:val="3000" w:hRule="atLeast"/>
           <w:cantSplit w:val="1"/>
+          <w:trHeight w:val="5670" w:hRule="exact"/>
         </w:trPr>
         <w:tc>
           <w:tcPr>
@@ -1324,8 +1324,8 @@
       </w:tr>
       <w:tr>
         <w:trPr>
-          <w:trHeight w:val="3000" w:hRule="atLeast"/>
           <w:cantSplit w:val="1"/>
+          <w:trHeight w:val="5670" w:hRule="exact"/>
         </w:trPr>
         <w:tc>
           <w:tcPr>
@@ -1448,8 +1448,8 @@
       </w:tr>
       <w:tr>
         <w:trPr>
-          <w:trHeight w:val="3000" w:hRule="atLeast"/>
           <w:cantSplit w:val="1"/>
+          <w:trHeight w:val="5670" w:hRule="exact"/>
         </w:trPr>
         <w:tc>
           <w:tcPr>
@@ -1608,8 +1608,8 @@
       </w:tr>
       <w:tr>
         <w:trPr>
-          <w:trHeight w:val="3000" w:hRule="atLeast"/>
           <w:cantSplit w:val="1"/>
+          <w:trHeight w:val="3969" w:hRule="exact"/>
         </w:trPr>
         <w:tc>
           <w:tcPr>
@@ -1722,8 +1722,8 @@
       </w:tr>
       <w:tr>
         <w:trPr>
-          <w:trHeight w:val="3000" w:hRule="atLeast"/>
           <w:cantSplit w:val="1"/>
+          <w:trHeight w:val="5670" w:hRule="exact"/>
         </w:trPr>
         <w:tc>
           <w:tcPr>

</xml_diff>

<commit_message>
Sync from Labs (5fae11c)
</commit_message>
<xml_diff>
--- a/Lab4/questionnaire/Lab 4 - Questionnaire.docx
+++ b/Lab4/questionnaire/Lab 4 - Questionnaire.docx
@@ -106,17 +106,38 @@
         <w:pStyle w:val="Heading1"/>
         <w:spacing w:before="240"/>
       </w:pPr>
+    </w:p>
+    <w:p>
+      <w:pPr>
+        <w:rPr>
+          <w:rFonts w:asciiTheme="majorHAnsi" w:eastAsiaTheme="majorEastAsia" w:hAnsiTheme="majorHAnsi" w:cstheme="majorBidi"/>
+          <w:b/>
+          <w:bCs/>
+          <w:color w:val="365F91" w:themeColor="accent1" w:themeShade="BF"/>
+          <w:sz w:val="28"/>
+          <w:szCs w:val="28"/>
+        </w:rPr>
+      </w:pPr>
       <w:r>
+        <w:br w:type="page"/>
+      </w:r>
+    </w:p>
+    <w:p>
+      <w:pPr>
+        <w:pStyle w:val="Heading1"/>
+        <w:spacing w:before="240"/>
+      </w:pPr>
+      <w:r>
+        <w:lastRenderedPageBreak/>
         <w:t>Stereo Matching and Shape from Silhouette</w:t>
       </w:r>
     </w:p>
     <w:p>
       <w:pPr>
         <w:pStyle w:val="Heading1"/>
-        <w:pageBreakBefore/>
+        <w:spacing w:before="240"/>
       </w:pPr>
       <w:r>
-        <w:lastRenderedPageBreak/>
         <w:t>1. Stereo Matching</w:t>
       </w:r>
     </w:p>
@@ -817,42 +838,7 @@
                 <w:b/>
                 <w:sz w:val="20"/>
               </w:rPr>
-              <w:t>Paste the</w:t>
-            </w:r>
-            <w:r>
-              <w:rPr>
-                <w:b/>
-                <w:sz w:val="20"/>
-              </w:rPr>
-              <w:t xml:space="preserve"> original images and the</w:t>
-            </w:r>
-            <w:r>
-              <w:rPr>
-                <w:b/>
-                <w:sz w:val="20"/>
-              </w:rPr>
-              <w:t xml:space="preserve"> </w:t>
-            </w:r>
-            <w:r>
-              <w:rPr>
-                <w:b/>
-                <w:sz w:val="20"/>
-              </w:rPr>
-              <w:t xml:space="preserve">estimated </w:t>
-            </w:r>
-            <w:r>
-              <w:rPr>
-                <w:b/>
-                <w:sz w:val="20"/>
-              </w:rPr>
-              <w:t>disparity maps</w:t>
-            </w:r>
-            <w:r>
-              <w:rPr>
-                <w:b/>
-                <w:sz w:val="20"/>
-              </w:rPr>
-              <w:t>.</w:t>
+              <w:t>Paste the original images and the estimated disparity maps.</w:t>
             </w:r>
           </w:p>
         </w:tc>
@@ -889,13 +875,7 @@
               <w:rPr>
                 <w:sz w:val="20"/>
               </w:rPr>
-              <w:t xml:space="preserve">• </w:t>
-            </w:r>
-            <w:r>
-              <w:rPr>
-                <w:sz w:val="20"/>
-              </w:rPr>
-              <w:t>Did it work? Did you expect these results? Why?</w:t>
+              <w:t>• Did it work? Did you expect these results? Why?</w:t>
             </w:r>
           </w:p>
           <w:p>
@@ -937,13 +917,7 @@
               <w:rPr>
                 <w:sz w:val="20"/>
               </w:rPr>
-              <w:t xml:space="preserve">• </w:t>
-            </w:r>
-            <w:r>
-              <w:rPr>
-                <w:sz w:val="20"/>
-              </w:rPr>
-              <w:t>Explain whether you had issues with the disparity estimation and how you solved them.</w:t>
+              <w:t>• Explain whether you had issues with the disparity estimation and how you solved them.</w:t>
             </w:r>
           </w:p>
         </w:tc>
@@ -1328,6 +1302,7 @@
         <w:pageBreakBefore/>
       </w:pPr>
       <w:r>
+        <w:lastRenderedPageBreak/>
         <w:t>AI usage reflection (Specific answers to this Lab)</w:t>
       </w:r>
     </w:p>
@@ -1342,19 +1317,19 @@
     <w:tbl>
       <w:tblPr>
         <w:tblStyle w:val="TableGrid"/>
-        <w:tblLook w:firstColumn="1" w:firstRow="1" w:lastColumn="0" w:lastRow="0" w:noHBand="0" w:noVBand="1" w:val="04A0"/>
         <w:tblW w:w="5000" w:type="pct"/>
+        <w:tblLook w:val="04A0" w:firstRow="1" w:lastRow="0" w:firstColumn="1" w:lastColumn="0" w:noHBand="0" w:noVBand="1"/>
       </w:tblPr>
       <w:tblGrid>
-        <w:gridCol w:w="9026"/>
+        <w:gridCol w:w="9242"/>
       </w:tblGrid>
       <w:tr>
         <w:trPr>
-          <w:cantSplit w:val="1"/>
+          <w:cantSplit/>
         </w:trPr>
         <w:tc>
           <w:tcPr>
-            <w:tcW w:type="dxa" w:w="9026"/>
+            <w:tcW w:w="9026" w:type="dxa"/>
           </w:tcPr>
           <w:p>
             <w:pPr>
@@ -1382,24 +1357,24 @@
       </w:tr>
       <w:tr>
         <w:trPr>
+          <w:cantSplit/>
           <w:trHeight w:val="1871"/>
-          <w:cantSplit w:val="1"/>
         </w:trPr>
         <w:tc>
           <w:tcPr>
-            <w:tcW w:type="dxa" w:w="9026"/>
+            <w:tcW w:w="9026" w:type="dxa"/>
           </w:tcPr>
           <w:p/>
         </w:tc>
       </w:tr>
       <w:tr>
         <w:trPr>
+          <w:cantSplit/>
           <w:trHeight w:val="454"/>
-          <w:cantSplit w:val="1"/>
         </w:trPr>
         <w:tc>
           <w:tcPr>
-            <w:tcW w:type="dxa" w:w="9026"/>
+            <w:tcW w:w="9026" w:type="dxa"/>
           </w:tcPr>
           <w:p>
             <w:pPr>
@@ -1427,24 +1402,24 @@
       </w:tr>
       <w:tr>
         <w:trPr>
+          <w:cantSplit/>
           <w:trHeight w:val="1928"/>
-          <w:cantSplit w:val="1"/>
         </w:trPr>
         <w:tc>
           <w:tcPr>
-            <w:tcW w:type="dxa" w:w="9026"/>
+            <w:tcW w:w="9026" w:type="dxa"/>
           </w:tcPr>
           <w:p/>
         </w:tc>
       </w:tr>
       <w:tr>
         <w:trPr>
+          <w:cantSplit/>
           <w:trHeight w:val="397"/>
-          <w:cantSplit w:val="1"/>
         </w:trPr>
         <w:tc>
           <w:tcPr>
-            <w:tcW w:type="dxa" w:w="9026"/>
+            <w:tcW w:w="9026" w:type="dxa"/>
           </w:tcPr>
           <w:p>
             <w:pPr>
@@ -1461,33 +1436,23 @@
       </w:tr>
       <w:tr>
         <w:trPr>
+          <w:cantSplit/>
           <w:trHeight w:val="2722"/>
-          <w:cantSplit w:val="1"/>
         </w:trPr>
         <w:tc>
           <w:tcPr>
-            <w:tcW w:type="dxa" w:w="9026"/>
+            <w:tcW w:w="9026" w:type="dxa"/>
           </w:tcPr>
           <w:p/>
         </w:tc>
       </w:tr>
-    </w:tbl>
-    <w:tbl>
-      <w:tblPr>
-        <w:tblStyle w:val="TableGrid"/>
-        <w:tblLook w:firstColumn="1" w:firstRow="1" w:lastColumn="0" w:lastRow="0" w:noHBand="0" w:noVBand="1" w:val="04A0"/>
-        <w:tblW w:w="5000" w:type="pct"/>
-      </w:tblPr>
-      <w:tblGrid>
-        <w:gridCol w:w="9026"/>
-      </w:tblGrid>
       <w:tr>
         <w:trPr>
-          <w:cantSplit w:val="1"/>
+          <w:cantSplit/>
         </w:trPr>
         <w:tc>
           <w:tcPr>
-            <w:tcW w:type="dxa" w:w="9026"/>
+            <w:tcW w:w="9026" w:type="dxa"/>
           </w:tcPr>
           <w:p>
             <w:pPr>
@@ -1497,6 +1462,7 @@
               <w:rPr>
                 <w:sz w:val="20"/>
               </w:rPr>
+              <w:lastRenderedPageBreak/>
               <w:t>Provide screenshots of the prompts you used and the resulting output from the tool:</w:t>
             </w:r>
           </w:p>
@@ -1515,24 +1481,24 @@
       </w:tr>
       <w:tr>
         <w:trPr>
+          <w:cantSplit/>
           <w:trHeight w:val="11056"/>
-          <w:cantSplit w:val="1"/>
         </w:trPr>
         <w:tc>
           <w:tcPr>
-            <w:tcW w:type="dxa" w:w="9026"/>
+            <w:tcW w:w="9026" w:type="dxa"/>
           </w:tcPr>
           <w:p/>
         </w:tc>
       </w:tr>
       <w:tr>
         <w:trPr>
+          <w:cantSplit/>
           <w:trHeight w:val="737"/>
-          <w:cantSplit w:val="1"/>
         </w:trPr>
         <w:tc>
           <w:tcPr>
-            <w:tcW w:type="dxa" w:w="9026"/>
+            <w:tcW w:w="9026" w:type="dxa"/>
           </w:tcPr>
           <w:p>
             <w:pPr>
@@ -1542,6 +1508,7 @@
               <w:rPr>
                 <w:sz w:val="20"/>
               </w:rPr>
+              <w:lastRenderedPageBreak/>
               <w:t>Failed Example: One instance where the tool did not perform as expected. Explain the reason for the failure.</w:t>
             </w:r>
           </w:p>
@@ -1549,12 +1516,12 @@
       </w:tr>
       <w:tr>
         <w:trPr>
+          <w:cantSplit/>
           <w:trHeight w:val="11113"/>
-          <w:cantSplit w:val="1"/>
         </w:trPr>
         <w:tc>
           <w:tcPr>
-            <w:tcW w:type="dxa" w:w="9026"/>
+            <w:tcW w:w="9026" w:type="dxa"/>
           </w:tcPr>
           <w:p/>
         </w:tc>
@@ -1566,25 +1533,26 @@
         <w:pageBreakBefore/>
       </w:pPr>
       <w:r>
+        <w:lastRenderedPageBreak/>
         <w:t>Self-awareness</w:t>
       </w:r>
     </w:p>
     <w:tbl>
       <w:tblPr>
         <w:tblStyle w:val="TableGrid"/>
-        <w:tblLook w:firstColumn="1" w:firstRow="1" w:lastColumn="0" w:lastRow="0" w:noHBand="0" w:noVBand="1" w:val="04A0"/>
         <w:tblW w:w="5000" w:type="pct"/>
+        <w:tblLook w:val="04A0" w:firstRow="1" w:lastRow="0" w:firstColumn="1" w:lastColumn="0" w:noHBand="0" w:noVBand="1"/>
       </w:tblPr>
       <w:tblGrid>
-        <w:gridCol w:w="9026"/>
+        <w:gridCol w:w="9242"/>
       </w:tblGrid>
       <w:tr>
         <w:trPr>
-          <w:cantSplit w:val="1"/>
+          <w:cantSplit/>
         </w:trPr>
         <w:tc>
           <w:tcPr>
-            <w:tcW w:type="dxa" w:w="9026"/>
+            <w:tcW w:w="9026" w:type="dxa"/>
           </w:tcPr>
           <w:p>
             <w:pPr>
@@ -1601,24 +1569,24 @@
       </w:tr>
       <w:tr>
         <w:trPr>
+          <w:cantSplit/>
           <w:trHeight w:val="2608"/>
-          <w:cantSplit w:val="1"/>
         </w:trPr>
         <w:tc>
           <w:tcPr>
-            <w:tcW w:type="dxa" w:w="9026"/>
+            <w:tcW w:w="9026" w:type="dxa"/>
           </w:tcPr>
           <w:p/>
         </w:tc>
       </w:tr>
       <w:tr>
         <w:trPr>
+          <w:cantSplit/>
           <w:trHeight w:val="340"/>
-          <w:cantSplit w:val="1"/>
         </w:trPr>
         <w:tc>
           <w:tcPr>
-            <w:tcW w:type="dxa" w:w="9026"/>
+            <w:tcW w:w="9026" w:type="dxa"/>
           </w:tcPr>
           <w:p>
             <w:pPr>
@@ -1635,23 +1603,23 @@
       </w:tr>
       <w:tr>
         <w:trPr>
+          <w:cantSplit/>
           <w:trHeight w:val="3459"/>
-          <w:cantSplit w:val="1"/>
         </w:trPr>
         <w:tc>
           <w:tcPr>
-            <w:tcW w:type="dxa" w:w="9026"/>
+            <w:tcW w:w="9026" w:type="dxa"/>
           </w:tcPr>
           <w:p/>
         </w:tc>
       </w:tr>
       <w:tr>
         <w:trPr>
-          <w:cantSplit w:val="1"/>
+          <w:cantSplit/>
         </w:trPr>
         <w:tc>
           <w:tcPr>
-            <w:tcW w:type="dxa" w:w="9026"/>
+            <w:tcW w:w="9026" w:type="dxa"/>
           </w:tcPr>
           <w:p>
             <w:pPr>
@@ -1668,23 +1636,23 @@
       </w:tr>
       <w:tr>
         <w:trPr>
+          <w:cantSplit/>
           <w:trHeight w:val="3005"/>
-          <w:cantSplit w:val="1"/>
         </w:trPr>
         <w:tc>
           <w:tcPr>
-            <w:tcW w:type="dxa" w:w="9026"/>
+            <w:tcW w:w="9026" w:type="dxa"/>
           </w:tcPr>
           <w:p/>
         </w:tc>
       </w:tr>
       <w:tr>
         <w:trPr>
-          <w:cantSplit w:val="1"/>
+          <w:cantSplit/>
         </w:trPr>
         <w:tc>
           <w:tcPr>
-            <w:tcW w:type="dxa" w:w="9026"/>
+            <w:tcW w:w="9026" w:type="dxa"/>
           </w:tcPr>
           <w:p>
             <w:pPr>
@@ -1694,6 +1662,7 @@
               <w:rPr>
                 <w:sz w:val="20"/>
               </w:rPr>
+              <w:lastRenderedPageBreak/>
               <w:t>Which parts of the notebook did you fail to solve? Be honest about the areas where you faced difficulties. What challenges or issues did you encounter that you couldn't resolve? How would you approach these issues in the future?</w:t>
             </w:r>
           </w:p>
@@ -1701,24 +1670,24 @@
       </w:tr>
       <w:tr>
         <w:trPr>
+          <w:cantSplit/>
           <w:trHeight w:val="2438"/>
-          <w:cantSplit w:val="1"/>
         </w:trPr>
         <w:tc>
           <w:tcPr>
-            <w:tcW w:type="dxa" w:w="9026"/>
+            <w:tcW w:w="9026" w:type="dxa"/>
           </w:tcPr>
           <w:p/>
         </w:tc>
       </w:tr>
       <w:tr>
         <w:trPr>
+          <w:cantSplit/>
           <w:trHeight w:val="567"/>
-          <w:cantSplit w:val="1"/>
         </w:trPr>
         <w:tc>
           <w:tcPr>
-            <w:tcW w:type="dxa" w:w="9026"/>
+            <w:tcW w:w="9026" w:type="dxa"/>
           </w:tcPr>
           <w:p>
             <w:pPr>
@@ -1735,12 +1704,12 @@
       </w:tr>
       <w:tr>
         <w:trPr>
+          <w:cantSplit/>
           <w:trHeight w:val="2835"/>
-          <w:cantSplit w:val="1"/>
         </w:trPr>
         <w:tc>
           <w:tcPr>
-            <w:tcW w:type="dxa" w:w="9026"/>
+            <w:tcW w:w="9026" w:type="dxa"/>
           </w:tcPr>
           <w:p/>
         </w:tc>
@@ -1752,6 +1721,7 @@
         <w:pageBreakBefore/>
       </w:pPr>
       <w:r>
+        <w:lastRenderedPageBreak/>
         <w:t>Extras</w:t>
       </w:r>
     </w:p>

</xml_diff>